<commit_message>
Keep DOCX section headings with their content
keepNext on section titles and job heads — SKILLS was orphaned at the
bottom of page 1.

Co-Authored-By: Claude Fable 5 <noreply@anthropic.com>
</commit_message>
<xml_diff>
--- a/assets/Charalampos-Photiou-CV.docx
+++ b/assets/Charalampos-Photiou-CV.docx
@@ -47,7 +47,7 @@
         </w:rPr>
         <w:t xml:space="preserve">Limassol, Cyprus  •  +357 96 425378  •  </w:t>
       </w:r>
-      <w:hyperlink w:history="1" r:id="rId89p-skxobfxrsm88asdp7">
+      <w:hyperlink w:history="1" r:id="rIdocpvlvgul8jjar6owuyny">
         <w:r>
           <w:rPr>
             <w:color w:val="5B6573"/>
@@ -65,7 +65,7 @@
         </w:rPr>
         <w:t xml:space="preserve">  •  </w:t>
       </w:r>
-      <w:hyperlink w:history="1" r:id="rIdg6xkcw6-j6ft2s_56gvrk">
+      <w:hyperlink w:history="1" r:id="rIdr90eilr8hfj1wctblbn3g">
         <w:r>
           <w:rPr>
             <w:color w:val="5B6573"/>
@@ -83,7 +83,7 @@
         </w:rPr>
         <w:t xml:space="preserve">  •  </w:t>
       </w:r>
-      <w:hyperlink w:history="1" r:id="rIdeukvpw3wmlm3z0eyu7fth">
+      <w:hyperlink w:history="1" r:id="rIdqvks2nibnoxr9quvzcxjz">
         <w:r>
           <w:rPr>
             <w:color w:val="5B6573"/>
@@ -96,6 +96,7 @@
     </w:p>
     <w:p>
       <w:pPr>
+        <w:keepNext/>
         <w:pBdr>
           <w:bottom w:val="single" w:color="D9DEE6" w:sz="6" w:space="4"/>
         </w:pBdr>
@@ -127,6 +128,7 @@
     </w:p>
     <w:p>
       <w:pPr>
+        <w:keepNext/>
         <w:pBdr>
           <w:bottom w:val="single" w:color="D9DEE6" w:sz="6" w:space="4"/>
         </w:pBdr>
@@ -145,6 +147,7 @@
     </w:p>
     <w:p>
       <w:pPr>
+        <w:keepNext/>
         <w:tabs>
           <w:tab w:val="right" w:pos="9026"/>
         </w:tabs>
@@ -330,6 +333,7 @@
     </w:p>
     <w:p>
       <w:pPr>
+        <w:keepNext/>
         <w:tabs>
           <w:tab w:val="right" w:pos="9026"/>
         </w:tabs>
@@ -425,6 +429,7 @@
     </w:p>
     <w:p>
       <w:pPr>
+        <w:keepNext/>
         <w:tabs>
           <w:tab w:val="right" w:pos="9026"/>
         </w:tabs>
@@ -520,6 +525,7 @@
     </w:p>
     <w:p>
       <w:pPr>
+        <w:keepNext/>
         <w:pBdr>
           <w:bottom w:val="single" w:color="D9DEE6" w:sz="6" w:space="4"/>
         </w:pBdr>
@@ -576,6 +582,7 @@
     </w:p>
     <w:p>
       <w:pPr>
+        <w:keepNext/>
         <w:pBdr>
           <w:bottom w:val="single" w:color="D9DEE6" w:sz="6" w:space="4"/>
         </w:pBdr>
@@ -725,6 +732,7 @@
     </w:p>
     <w:p>
       <w:pPr>
+        <w:keepNext/>
         <w:pBdr>
           <w:bottom w:val="single" w:color="D9DEE6" w:sz="6" w:space="4"/>
         </w:pBdr>
@@ -835,6 +843,7 @@
     </w:p>
     <w:p>
       <w:pPr>
+        <w:keepNext/>
         <w:pBdr>
           <w:bottom w:val="single" w:color="D9DEE6" w:sz="6" w:space="4"/>
         </w:pBdr>

</xml_diff>

<commit_message>
Apply recruiter-review fixes to CV (PDF + DOCX)
Findings from a three-lens review (ATS recruiter, hiring manager,
skeptical screener): lead with the hand-coded/AI development work;
add functional clarifiers to job titles so Web Developer is searchable;
honest tenure (since 2023 instead of 3+ years); GA4 named explicitly;
visible portfolio URL instead of link text; single-column education for
ATS parsing; junior/internship bullets compressed; cut table-football
line, filler certs, and PC gaming.

Co-Authored-By: Claude Fable 5 <noreply@anthropic.com>
</commit_message>
<xml_diff>
--- a/assets/Charalampos-Photiou-CV.docx
+++ b/assets/Charalampos-Photiou-CV.docx
@@ -47,7 +47,7 @@
         </w:rPr>
         <w:t xml:space="preserve">Limassol, Cyprus  •  +357 96 425378  •  </w:t>
       </w:r>
-      <w:hyperlink w:history="1" r:id="rIdocpvlvgul8jjar6owuyny">
+      <w:hyperlink w:history="1" r:id="rIdeeom7rny6iccz9fskusp_">
         <w:r>
           <w:rPr>
             <w:color w:val="5B6573"/>
@@ -65,7 +65,7 @@
         </w:rPr>
         <w:t xml:space="preserve">  •  </w:t>
       </w:r>
-      <w:hyperlink w:history="1" r:id="rIdr90eilr8hfj1wctblbn3g">
+      <w:hyperlink w:history="1" r:id="rId6z7r1wwmcw4t3gvcllu22">
         <w:r>
           <w:rPr>
             <w:color w:val="5B6573"/>
@@ -83,14 +83,14 @@
         </w:rPr>
         <w:t xml:space="preserve">  •  </w:t>
       </w:r>
-      <w:hyperlink w:history="1" r:id="rIdqvks2nibnoxr9quvzcxjz">
+      <w:hyperlink w:history="1" r:id="rIdqoccc65fhjre4icjgjzqd">
         <w:r>
           <w:rPr>
             <w:color w:val="5B6573"/>
             <w:sz w:val="17"/>
             <w:szCs w:val="17"/>
           </w:rPr>
-          <w:t xml:space="preserve">Portfolio</w:t>
+          <w:t xml:space="preserve">xaralamposg9.github.io/portfolio</w:t>
         </w:r>
       </w:hyperlink>
     </w:p>
@@ -123,7 +123,7 @@
           <w:sz w:val="19"/>
           <w:szCs w:val="19"/>
         </w:rPr>
-        <w:t xml:space="preserve">Web developer and digital marketing executive with 3+ years at Fameline Holding Group, pairing hands-on web development with full-funnel marketing. Manages a portfolio of 50+ live websites: builds on WordPress (Elementor Pro, WPBakery, Divi) and hand-codes custom sites in VS Code with Git/GitHub and AI-assisted workflows, and maintains and develops MODX Revolution sites. Runs paid media on Google Ads (Search to Performance Max), email marketing in Mailchimp and Brevo, SEO, and social — backed by Google and AI certifications.</w:t>
+        <w:t xml:space="preserve">Web developer and digital marketing executive at Fameline Holding Group since 2023. Hand-codes custom production websites in VS Code with Git/GitHub and AI-assisted workflows (Claude Code), builds on WordPress (Elementor Pro, WPBakery, Divi), and maintains and develops MODX Revolution sites — a portfolio of 50+ live websites. Runs paid media on Google Ads (Search to Performance Max), email marketing in Mailchimp and Brevo, SEO, and social — backed by Google and AI certifications.</w:t>
       </w:r>
     </w:p>
     <w:p>
@@ -161,7 +161,7 @@
           <w:sz w:val="21"/>
           <w:szCs w:val="21"/>
         </w:rPr>
-        <w:t xml:space="preserve">Digital Marketing Executive</w:t>
+        <w:t xml:space="preserve">Digital Marketing Executive (Web Development &amp; Paid Media)</w:t>
       </w:r>
       <w:r>
         <w:rPr>
@@ -202,25 +202,25 @@
           <w:sz w:val="19"/>
           <w:szCs w:val="19"/>
         </w:rPr>
-        <w:t xml:space="preserve">Design, build, and maintain WordPress sites (Elementor Pro, WPBakery &amp; other builders) and develop custom sites in VS Code with Git/GitHub and AI-assisted coding (e.g. Claude Code).</w:t>
-      </w:r>
-    </w:p>
-    <w:p>
-      <w:pPr>
-        <w:pStyle w:val="ListParagraph"/>
-        <w:numPr>
-          <w:ilvl w:val="0"/>
-          <w:numId w:val="1"/>
-        </w:numPr>
-        <w:spacing w:after="30"/>
-      </w:pPr>
-      <w:r>
-        <w:rPr>
-          <w:color w:val="2B313B"/>
-          <w:sz w:val="19"/>
-          <w:szCs w:val="19"/>
-        </w:rPr>
-        <w:t xml:space="preserve">Maintain and develop MODX Revolution sites across the group’s brands — edits, updates, and new content.</w:t>
+        <w:t xml:space="preserve">Hand-code custom production websites in VS Code with Git/GitHub and AI-assisted workflows (Claude Code) — six live corporate sites shipped without a CMS.</w:t>
+      </w:r>
+    </w:p>
+    <w:p>
+      <w:pPr>
+        <w:pStyle w:val="ListParagraph"/>
+        <w:numPr>
+          <w:ilvl w:val="0"/>
+          <w:numId w:val="1"/>
+        </w:numPr>
+        <w:spacing w:after="30"/>
+      </w:pPr>
+      <w:r>
+        <w:rPr>
+          <w:color w:val="2B313B"/>
+          <w:sz w:val="19"/>
+          <w:szCs w:val="19"/>
+        </w:rPr>
+        <w:t xml:space="preserve">Design, build, and maintain WordPress sites (Elementor Pro, WPBakery &amp; other builders); maintain and develop MODX Revolution sites across the group’s brands.</w:t>
       </w:r>
     </w:p>
     <w:p>
@@ -256,25 +256,43 @@
           <w:sz w:val="19"/>
           <w:szCs w:val="19"/>
         </w:rPr>
-        <w:t xml:space="preserve">Plan and run paid campaigns on Google Ads (Search, Display, Video, Demand Gen &amp; Performance Max), Meta &amp; LinkedIn — 440K+ impressions and 16K+ clicks/engagements at a 3.6% average interaction rate.</w:t>
-      </w:r>
-    </w:p>
-    <w:p>
-      <w:pPr>
-        <w:pStyle w:val="ListParagraph"/>
-        <w:numPr>
-          <w:ilvl w:val="0"/>
-          <w:numId w:val="1"/>
-        </w:numPr>
-        <w:spacing w:after="30"/>
-      </w:pPr>
-      <w:r>
-        <w:rPr>
-          <w:color w:val="2B313B"/>
-          <w:sz w:val="19"/>
-          <w:szCs w:val="19"/>
-        </w:rPr>
-        <w:t xml:space="preserve">Schedule the group’s social media and build &amp; send email campaigns in Mailchimp and Brevo.</w:t>
+        <w:t xml:space="preserve">Set up tracking &amp; analytics with Google Tag Manager and Google Analytics 4 (GA4).</w:t>
+      </w:r>
+    </w:p>
+    <w:p>
+      <w:pPr>
+        <w:pStyle w:val="ListParagraph"/>
+        <w:numPr>
+          <w:ilvl w:val="0"/>
+          <w:numId w:val="1"/>
+        </w:numPr>
+        <w:spacing w:after="30"/>
+      </w:pPr>
+      <w:r>
+        <w:rPr>
+          <w:color w:val="2B313B"/>
+          <w:sz w:val="19"/>
+          <w:szCs w:val="19"/>
+        </w:rPr>
+        <w:t xml:space="preserve">Plan and run paid campaigns on Google Ads (Search, Display, Video, Demand Gen &amp; Performance Max), Meta &amp; LinkedIn — 440K+ impressions and 16K+ clicks at a 3.6% average interaction rate.</w:t>
+      </w:r>
+    </w:p>
+    <w:p>
+      <w:pPr>
+        <w:pStyle w:val="ListParagraph"/>
+        <w:numPr>
+          <w:ilvl w:val="0"/>
+          <w:numId w:val="1"/>
+        </w:numPr>
+        <w:spacing w:after="30"/>
+      </w:pPr>
+      <w:r>
+        <w:rPr>
+          <w:color w:val="2B313B"/>
+          <w:sz w:val="19"/>
+          <w:szCs w:val="19"/>
+        </w:rPr>
+        <w:t xml:space="preserve">Own the group’s social media calendar and build &amp; send email campaigns in Mailchimp and Brevo.</w:t>
       </w:r>
     </w:p>
     <w:p>
@@ -310,25 +328,7 @@
           <w:sz w:val="19"/>
           <w:szCs w:val="19"/>
         </w:rPr>
-        <w:t xml:space="preserve">Help run the group’s flagship events (East Med Marine &amp; Offshore Exhibition, Fameline Offshore Sailing Regatta) and CSR campaigns (Movember, World Cancer Day); organise the internal table-football charity tournament.</w:t>
-      </w:r>
-    </w:p>
-    <w:p>
-      <w:pPr>
-        <w:pStyle w:val="ListParagraph"/>
-        <w:numPr>
-          <w:ilvl w:val="0"/>
-          <w:numId w:val="1"/>
-        </w:numPr>
-        <w:spacing w:after="30"/>
-      </w:pPr>
-      <w:r>
-        <w:rPr>
-          <w:color w:val="2B313B"/>
-          <w:sz w:val="19"/>
-          <w:szCs w:val="19"/>
-        </w:rPr>
-        <w:t xml:space="preserve">Set up tracking &amp; analytics with Google Tag Manager and Google Analytics.</w:t>
+        <w:t xml:space="preserve">Deliver digital marketing for the group’s flagship events (East Med Marine &amp; Offshore Exhibition, Fameline Offshore Sailing Regatta) and CSR campaigns (Movember, World Cancer Day).</w:t>
       </w:r>
     </w:p>
     <w:p>
@@ -347,7 +347,7 @@
           <w:sz w:val="21"/>
           <w:szCs w:val="21"/>
         </w:rPr>
-        <w:t xml:space="preserve">Junior Digital Marketing Officer</w:t>
+        <w:t xml:space="preserve">Junior Digital Marketing Officer (WordPress Development)</w:t>
       </w:r>
       <w:r>
         <w:rPr>
@@ -406,25 +406,7 @@
           <w:sz w:val="19"/>
           <w:szCs w:val="19"/>
         </w:rPr>
-        <w:t xml:space="preserve">Created graphics and scheduled social media posts to support marketing campaigns.</w:t>
-      </w:r>
-    </w:p>
-    <w:p>
-      <w:pPr>
-        <w:pStyle w:val="ListParagraph"/>
-        <w:numPr>
-          <w:ilvl w:val="0"/>
-          <w:numId w:val="1"/>
-        </w:numPr>
-        <w:spacing w:after="30"/>
-      </w:pPr>
-      <w:r>
-        <w:rPr>
-          <w:color w:val="2B313B"/>
-          <w:sz w:val="19"/>
-          <w:szCs w:val="19"/>
-        </w:rPr>
-        <w:t xml:space="preserve">Helped with the group’s events and awareness campaigns — scheduling social posts and sending email campaigns.</w:t>
+        <w:t xml:space="preserve">Created graphics and scheduled social media posts supporting campaigns and group events.</w:t>
       </w:r>
     </w:p>
     <w:p>
@@ -484,43 +466,7 @@
           <w:sz w:val="19"/>
           <w:szCs w:val="19"/>
         </w:rPr>
-        <w:t xml:space="preserve">Developed dynamic WordPress websites end to end, from concept to launch.</w:t>
-      </w:r>
-    </w:p>
-    <w:p>
-      <w:pPr>
-        <w:pStyle w:val="ListParagraph"/>
-        <w:numPr>
-          <w:ilvl w:val="0"/>
-          <w:numId w:val="1"/>
-        </w:numPr>
-        <w:spacing w:after="30"/>
-      </w:pPr>
-      <w:r>
-        <w:rPr>
-          <w:color w:val="2B313B"/>
-          <w:sz w:val="19"/>
-          <w:szCs w:val="19"/>
-        </w:rPr>
-        <w:t xml:space="preserve">Curated and grew the company’s social media channels, boosting visibility and engagement.</w:t>
-      </w:r>
-    </w:p>
-    <w:p>
-      <w:pPr>
-        <w:pStyle w:val="ListParagraph"/>
-        <w:numPr>
-          <w:ilvl w:val="0"/>
-          <w:numId w:val="1"/>
-        </w:numPr>
-        <w:spacing w:after="30"/>
-      </w:pPr>
-      <w:r>
-        <w:rPr>
-          <w:color w:val="2B313B"/>
-          <w:sz w:val="19"/>
-          <w:szCs w:val="19"/>
-        </w:rPr>
-        <w:t xml:space="preserve">Created content and campaigns that contributed to increased sales; captured product photography.</w:t>
+        <w:t xml:space="preserve">Built WordPress sites end to end and produced product photography and social content for client campaigns.</w:t>
       </w:r>
     </w:p>
     <w:p>
@@ -577,7 +523,7 @@
           <w:sz w:val="19"/>
           <w:szCs w:val="19"/>
         </w:rPr>
-        <w:t xml:space="preserve"> — on WordPress + Elementor (Fameline Holding Group, Fameline Mission Solutions, OneNet Group, MIE Group, Euploia Partners, NorthTide, Kozy Developers) and hand-coded in VS Code (Albaflux, Seaflux and the Cargo Logistics brands). I also maintain and develop 13 MODX Revolution sites (Fameline Energy, Sheerline, HSS Marine Safety, Euploia Drydocks, and more). Full list with live links on the portfolio.</w:t>
+        <w:t xml:space="preserve"> — on WordPress + Elementor (Fameline Holding Group, Fameline Mission Solutions, OneNet Group, MIE Group, Euploia Partners, NorthTide, Kozy Developers) and hand-coded in VS Code (Albaflux, Seaflux and the Cargo Logistics brands). I also maintain and develop 13 MODX Revolution sites (Fameline Energy, Sheerline, HSS Marine Safety, Euploia Drydocks, and more). Full list with live links: xaralamposg9.github.io/portfolio</w:t>
       </w:r>
     </w:p>
     <w:p>
@@ -691,43 +637,7 @@
           <w:sz w:val="19"/>
           <w:szCs w:val="19"/>
         </w:rPr>
-        <w:t xml:space="preserve">YouTube Music Assessment — Google (Jun 2024)</w:t>
-      </w:r>
-    </w:p>
-    <w:p>
-      <w:pPr>
-        <w:pStyle w:val="ListParagraph"/>
-        <w:numPr>
-          <w:ilvl w:val="0"/>
-          <w:numId w:val="1"/>
-        </w:numPr>
-        <w:spacing w:after="30"/>
-      </w:pPr>
-      <w:r>
-        <w:rPr>
-          <w:color w:val="2B313B"/>
-          <w:sz w:val="19"/>
-          <w:szCs w:val="19"/>
-        </w:rPr>
-        <w:t xml:space="preserve">21st Advertising, Marketing, Media &amp; Communication Conference — Certificate of Attendance (Jun 2024)</w:t>
-      </w:r>
-    </w:p>
-    <w:p>
-      <w:pPr>
-        <w:pStyle w:val="ListParagraph"/>
-        <w:numPr>
-          <w:ilvl w:val="0"/>
-          <w:numId w:val="1"/>
-        </w:numPr>
-        <w:spacing w:after="30"/>
-      </w:pPr>
-      <w:r>
-        <w:rPr>
-          <w:color w:val="2B313B"/>
-          <w:sz w:val="19"/>
-          <w:szCs w:val="19"/>
-        </w:rPr>
-        <w:t xml:space="preserve">IGCSE English as a Second Language, Grade C — University of Cambridge</w:t>
+        <w:t xml:space="preserve">IGCSE English as a Second Language — University of Cambridge</w:t>
       </w:r>
     </w:p>
     <w:p>
@@ -792,7 +702,7 @@
           <w:sz w:val="19"/>
           <w:szCs w:val="19"/>
         </w:rPr>
-        <w:t xml:space="preserve">Technical &amp; on-page SEO, Google Ads, Meta &amp; LinkedIn Ads, paid social, social media management &amp; scheduling, email marketing (Mailchimp, Brevo), campaign management, Google Tag Manager &amp; Analytics, Google Business / local SEO, YouTube, audience growth.</w:t>
+        <w:t xml:space="preserve">Technical &amp; on-page SEO, Google Ads, Meta &amp; LinkedIn Ads, paid social, social media management &amp; scheduling, email marketing (Mailchimp, Brevo), campaign management, Google Tag Manager, Google Analytics 4 (GA4), Google Business / local SEO, YouTube, audience growth.</w:t>
       </w:r>
     </w:p>
     <w:p>
@@ -926,7 +836,7 @@
           <w:sz w:val="19"/>
           <w:szCs w:val="19"/>
         </w:rPr>
-        <w:t xml:space="preserve">Playing bouzouki · Photography · PC gaming.</w:t>
+        <w:t xml:space="preserve">Playing bouzouki · Photography.</w:t>
       </w:r>
     </w:p>
     <w:sectPr>

</xml_diff>

<commit_message>
CV: use official title in header, reconcile 31 vs 50+ site counts
Header and running header now read Digital Marketing Executive - Web
Development & Paid Media (the verifiable job title). The 31 portfolio
sites are framed as a showcased selection of the 50+ web properties
managed, so the numbers no longer contradict each other.

Co-Authored-By: Claude Fable 5 <noreply@anthropic.com>
</commit_message>
<xml_diff>
--- a/assets/Charalampos-Photiou-CV.docx
+++ b/assets/Charalampos-Photiou-CV.docx
@@ -29,7 +29,7 @@
           <w:sz w:val="24"/>
           <w:szCs w:val="24"/>
         </w:rPr>
-        <w:t xml:space="preserve">Web Developer &amp; Digital Marketing Executive</w:t>
+        <w:t xml:space="preserve">Digital Marketing Executive · Web Development &amp; Paid Media</w:t>
       </w:r>
     </w:p>
     <w:p>
@@ -47,7 +47,7 @@
         </w:rPr>
         <w:t xml:space="preserve">Limassol, Cyprus  •  +357 96 425378  •  </w:t>
       </w:r>
-      <w:hyperlink w:history="1" r:id="rIdeeom7rny6iccz9fskusp_">
+      <w:hyperlink w:history="1" r:id="rIdm6sqnwpv4andol2kialal">
         <w:r>
           <w:rPr>
             <w:color w:val="5B6573"/>
@@ -65,7 +65,7 @@
         </w:rPr>
         <w:t xml:space="preserve">  •  </w:t>
       </w:r>
-      <w:hyperlink w:history="1" r:id="rId6z7r1wwmcw4t3gvcllu22">
+      <w:hyperlink w:history="1" r:id="rIdfcrxls9ugw9moctw8lr7o">
         <w:r>
           <w:rPr>
             <w:color w:val="5B6573"/>
@@ -83,7 +83,7 @@
         </w:rPr>
         <w:t xml:space="preserve">  •  </w:t>
       </w:r>
-      <w:hyperlink w:history="1" r:id="rIdqoccc65fhjre4icjgjzqd">
+      <w:hyperlink w:history="1" r:id="rIdl1stavkihh2bcq-y-ujmx">
         <w:r>
           <w:rPr>
             <w:color w:val="5B6573"/>
@@ -238,7 +238,7 @@
           <w:sz w:val="19"/>
           <w:szCs w:val="19"/>
         </w:rPr>
-        <w:t xml:space="preserve">Manage a portfolio of 50+ live websites — updates, performance, uptime, and security across the group’s brands.</w:t>
+        <w:t xml:space="preserve">Manage a portfolio of 50+ live web properties across the group’s brands — updates, performance, uptime, and security; 31 selected sites are showcased with live links on my portfolio.</w:t>
       </w:r>
     </w:p>
     <w:p>
@@ -523,7 +523,7 @@
           <w:sz w:val="19"/>
           <w:szCs w:val="19"/>
         </w:rPr>
-        <w:t xml:space="preserve"> — on WordPress + Elementor (Fameline Holding Group, Fameline Mission Solutions, OneNet Group, MIE Group, Euploia Partners, NorthTide, Kozy Developers) and hand-coded in VS Code (Albaflux, Seaflux and the Cargo Logistics brands). I also maintain and develop 13 MODX Revolution sites (Fameline Energy, Sheerline, HSS Marine Safety, Euploia Drydocks, and more). Full list with live links: xaralamposg9.github.io/portfolio</w:t>
+        <w:t xml:space="preserve"> — on WordPress + Elementor (Fameline Holding Group, Fameline Mission Solutions, OneNet Group, MIE Group, Euploia Partners, NorthTide, Kozy Developers) and hand-coded in VS Code (Albaflux, Seaflux and the Cargo Logistics brands). I also maintain and develop 13 MODX Revolution sites (Fameline Energy, Sheerline, HSS Marine Safety, Euploia Drydocks, and more). These 31 sites are the selection I showcase from the 50+ web properties I manage — all with live links: xaralamposg9.github.io/portfolio</w:t>
       </w:r>
     </w:p>
     <w:p>

</xml_diff>

<commit_message>
CV: quantify email marketing bullet from real campaign data
Mailchimp externals: lists up to 8,000+ contacts (BWSS send), top
campaign ~50% opens / ~53% clicks (Sailing Save-the-date #2).

Co-Authored-By: Claude Fable 5 <noreply@anthropic.com>
</commit_message>
<xml_diff>
--- a/assets/Charalampos-Photiou-CV.docx
+++ b/assets/Charalampos-Photiou-CV.docx
@@ -47,7 +47,7 @@
         </w:rPr>
         <w:t xml:space="preserve">Limassol, Cyprus  •  +357 96 425378  •  </w:t>
       </w:r>
-      <w:hyperlink w:history="1" r:id="rIdm6sqnwpv4andol2kialal">
+      <w:hyperlink w:history="1" r:id="rIdce2hqletvgjawkiggrzqo">
         <w:r>
           <w:rPr>
             <w:color w:val="5B6573"/>
@@ -65,7 +65,7 @@
         </w:rPr>
         <w:t xml:space="preserve">  •  </w:t>
       </w:r>
-      <w:hyperlink w:history="1" r:id="rIdfcrxls9ugw9moctw8lr7o">
+      <w:hyperlink w:history="1" r:id="rIdy8esgjemcfrujaq8o_ths">
         <w:r>
           <w:rPr>
             <w:color w:val="5B6573"/>
@@ -83,7 +83,7 @@
         </w:rPr>
         <w:t xml:space="preserve">  •  </w:t>
       </w:r>
-      <w:hyperlink w:history="1" r:id="rIdl1stavkihh2bcq-y-ujmx">
+      <w:hyperlink w:history="1" r:id="rId77ssbe2zzdlxbkggbiky9">
         <w:r>
           <w:rPr>
             <w:color w:val="5B6573"/>
@@ -292,7 +292,7 @@
           <w:sz w:val="19"/>
           <w:szCs w:val="19"/>
         </w:rPr>
-        <w:t xml:space="preserve">Own the group’s social media calendar and build &amp; send email campaigns in Mailchimp and Brevo.</w:t>
+        <w:t xml:space="preserve">Own the group’s social media calendar and email marketing in Mailchimp and Brevo — campaigns to B2B lists of up to 8,000+ maritime contacts, top sends reaching ~50% opens and ~53% click-through.</w:t>
       </w:r>
     </w:p>
     <w:p>

</xml_diff>

<commit_message>
CV: add measured Lighthouse page-speed scores
Ran Lighthouse (mobile, performance) against the live sites:
fhg.global 94, albaflux.com 90, seaflux.global 83. New bullet cites the
two 90+ scores, closing the page-speed-claimed-but-never-shown gap.

Co-Authored-By: Claude Fable 5 <noreply@anthropic.com>
</commit_message>
<xml_diff>
--- a/assets/Charalampos-Photiou-CV.docx
+++ b/assets/Charalampos-Photiou-CV.docx
@@ -47,7 +47,7 @@
         </w:rPr>
         <w:t xml:space="preserve">Limassol, Cyprus  •  +357 96 425378  •  </w:t>
       </w:r>
-      <w:hyperlink w:history="1" r:id="rIdce2hqletvgjawkiggrzqo">
+      <w:hyperlink w:history="1" r:id="rIdh3dmoikuonsx7uqj5nq_d">
         <w:r>
           <w:rPr>
             <w:color w:val="5B6573"/>
@@ -65,7 +65,7 @@
         </w:rPr>
         <w:t xml:space="preserve">  •  </w:t>
       </w:r>
-      <w:hyperlink w:history="1" r:id="rIdy8esgjemcfrujaq8o_ths">
+      <w:hyperlink w:history="1" r:id="rIdo10aekwehccq-mb4kthn2">
         <w:r>
           <w:rPr>
             <w:color w:val="5B6573"/>
@@ -83,7 +83,7 @@
         </w:rPr>
         <w:t xml:space="preserve">  •  </w:t>
       </w:r>
-      <w:hyperlink w:history="1" r:id="rId77ssbe2zzdlxbkggbiky9">
+      <w:hyperlink w:history="1" r:id="rIdvb3ycgpkdlbodoxqrvgcj">
         <w:r>
           <w:rPr>
             <w:color w:val="5B6573"/>
@@ -257,6 +257,24 @@
           <w:szCs w:val="19"/>
         </w:rPr>
         <w:t xml:space="preserve">Set up tracking &amp; analytics with Google Tag Manager and Google Analytics 4 (GA4).</w:t>
+      </w:r>
+    </w:p>
+    <w:p>
+      <w:pPr>
+        <w:pStyle w:val="ListParagraph"/>
+        <w:numPr>
+          <w:ilvl w:val="0"/>
+          <w:numId w:val="1"/>
+        </w:numPr>
+        <w:spacing w:after="30"/>
+      </w:pPr>
+      <w:r>
+        <w:rPr>
+          <w:color w:val="2B313B"/>
+          <w:sz w:val="19"/>
+          <w:szCs w:val="19"/>
+        </w:rPr>
+        <w:t xml:space="preserve">Optimise page speed across the portfolio — flagship sites score 90+ on mobile Lighthouse performance (fhg.global 94, albaflux.com 90).</w:t>
       </w:r>
     </w:p>
     <w:p>

</xml_diff>

<commit_message>
MODX role is maintain-only, on the site and the CV
User maintains the 13 MODX Revolution sites but did not develop them —
every maintain-and-develop phrasing corrected across index.html, the CV
summary, experience bullet, and Selected Work paragraph (PDF + DOCX
rebuilt).

Co-Authored-By: Claude Fable 5 <noreply@anthropic.com>
</commit_message>
<xml_diff>
--- a/assets/Charalampos-Photiou-CV.docx
+++ b/assets/Charalampos-Photiou-CV.docx
@@ -47,7 +47,7 @@
         </w:rPr>
         <w:t xml:space="preserve">Limassol, Cyprus  •  +357 96 425378  •  </w:t>
       </w:r>
-      <w:hyperlink w:history="1" r:id="rIdh3dmoikuonsx7uqj5nq_d">
+      <w:hyperlink w:history="1" r:id="rIddnxuqxyksvioimbuzgl8y">
         <w:r>
           <w:rPr>
             <w:color w:val="5B6573"/>
@@ -65,7 +65,7 @@
         </w:rPr>
         <w:t xml:space="preserve">  •  </w:t>
       </w:r>
-      <w:hyperlink w:history="1" r:id="rIdo10aekwehccq-mb4kthn2">
+      <w:hyperlink w:history="1" r:id="rIdfyah2mqahr5odupyywjvs">
         <w:r>
           <w:rPr>
             <w:color w:val="5B6573"/>
@@ -83,7 +83,7 @@
         </w:rPr>
         <w:t xml:space="preserve">  •  </w:t>
       </w:r>
-      <w:hyperlink w:history="1" r:id="rIdvb3ycgpkdlbodoxqrvgcj">
+      <w:hyperlink w:history="1" r:id="rIdsx1bkbejeaex5lbbzg6ky">
         <w:r>
           <w:rPr>
             <w:color w:val="5B6573"/>
@@ -123,7 +123,7 @@
           <w:sz w:val="19"/>
           <w:szCs w:val="19"/>
         </w:rPr>
-        <w:t xml:space="preserve">Web developer and digital marketing executive at Fameline Holding Group since 2023. Hand-codes custom production websites in VS Code with Git/GitHub and AI-assisted workflows (Claude Code), builds on WordPress (Elementor Pro, WPBakery, Divi), and maintains and develops MODX Revolution sites — a portfolio of 50+ live websites. Runs paid media on Google Ads (Search to Performance Max), email marketing in Mailchimp and Brevo, SEO, and social — backed by Google and AI certifications.</w:t>
+        <w:t xml:space="preserve">Web developer and digital marketing executive at Fameline Holding Group since 2023. Hand-codes custom production websites in VS Code with Git/GitHub and AI-assisted workflows (Claude Code), builds on WordPress (Elementor Pro, WPBakery, Divi), and maintains MODX Revolution sites — a portfolio of 50+ live websites. Runs paid media on Google Ads (Search to Performance Max), email marketing in Mailchimp and Brevo, SEO, and social — backed by Google and AI certifications.</w:t>
       </w:r>
     </w:p>
     <w:p>
@@ -220,7 +220,7 @@
           <w:sz w:val="19"/>
           <w:szCs w:val="19"/>
         </w:rPr>
-        <w:t xml:space="preserve">Design, build, and maintain WordPress sites (Elementor Pro, WPBakery &amp; other builders); maintain and develop MODX Revolution sites across the group’s brands.</w:t>
+        <w:t xml:space="preserve">Design, build, and maintain WordPress sites (Elementor Pro, WPBakery &amp; other builders); maintain MODX Revolution sites across the group’s brands.</w:t>
       </w:r>
     </w:p>
     <w:p>
@@ -541,7 +541,7 @@
           <w:sz w:val="19"/>
           <w:szCs w:val="19"/>
         </w:rPr>
-        <w:t xml:space="preserve"> — on WordPress + Elementor (Fameline Holding Group, Fameline Mission Solutions, OneNet Group, MIE Group, Euploia Partners, NorthTide, Kozy Developers) and hand-coded in VS Code (Albaflux, Seaflux and the Cargo Logistics brands). I also maintain and develop 13 MODX Revolution sites (Fameline Energy, Sheerline, HSS Marine Safety, Euploia Drydocks, and more). These 31 sites are the selection I showcase from the 50+ web properties I manage — all with live links: xaralamposg9.github.io/portfolio</w:t>
+        <w:t xml:space="preserve"> — on WordPress + Elementor (Fameline Holding Group, Fameline Mission Solutions, OneNet Group, MIE Group, Euploia Partners, NorthTide, Kozy Developers) and hand-coded in VS Code (Albaflux, Seaflux and the Cargo Logistics brands). I also maintain 13 MODX Revolution sites (Fameline Energy, Sheerline, HSS Marine Safety, Euploia Drydocks, and more). These 31 sites are the selection I showcase from the 50+ web properties I manage — all with live links: xaralamposg9.github.io/portfolio</w:t>
       </w:r>
     </w:p>
     <w:p>

</xml_diff>